<commit_message>
Windows-startscript (start.bat) + handleiding bijgewerkt
Voegt start.bat toe: dubbelklik installeert en activeert de tool, laadt de
API-sleutel uit .env en laat een gereed venster achter. .gitattributes borgt
CRLF voor .bat. Handleiding (md + docx) vermeldt de Windows-snelstart.

Co-Authored-By: Claude Opus 4.8 (1M context) <noreply@anthropic.com>
Claude-Session: https://claude.ai/code/session_011fEq7fbBgWcAuPdA9DvfKA
</commit_message>
<xml_diff>
--- a/rie_toetsing/HANDLEIDING.docx
+++ b/rie_toetsing/HANDLEIDING.docx
@@ -44,6 +44,99 @@
           <w:sz w:val="26"/>
         </w:rPr>
         <w:t>Deel A — Eenmalig instellen</w:t>
+      </w:r>
+    </w:p>
+    <w:p>
+      <w:r>
+        <w:rPr>
+          <w:rFonts w:ascii="Aptos" w:hAnsi="Aptos"/>
+          <w:b/>
+          <w:i/>
+        </w:rPr>
+        <w:t>Windows-snelstart:</w:t>
+      </w:r>
+      <w:r>
+        <w:rPr>
+          <w:rFonts w:ascii="Aptos" w:hAnsi="Aptos"/>
+          <w:i/>
+        </w:rPr>
+        <w:t xml:space="preserve"> dubbelklik op </w:t>
+      </w:r>
+      <w:r>
+        <w:rPr>
+          <w:rFonts w:ascii="Consolas" w:hAnsi="Consolas"/>
+          <w:i/>
+        </w:rPr>
+        <w:t>start.bat</w:t>
+      </w:r>
+      <w:r>
+        <w:rPr>
+          <w:rFonts w:ascii="Aptos" w:hAnsi="Aptos"/>
+          <w:i/>
+        </w:rPr>
+        <w:t xml:space="preserve"> in de map </w:t>
+      </w:r>
+      <w:r>
+        <w:rPr>
+          <w:rFonts w:ascii="Consolas" w:hAnsi="Consolas"/>
+          <w:i/>
+        </w:rPr>
+        <w:t>rie_toetsing</w:t>
+      </w:r>
+      <w:r>
+        <w:rPr>
+          <w:rFonts w:ascii="Aptos" w:hAnsi="Aptos"/>
+          <w:i/>
+        </w:rPr>
+        <w:t>. Dat</w:t>
+      </w:r>
+    </w:p>
+    <w:p>
+      <w:r>
+        <w:rPr>
+          <w:rFonts w:ascii="Aptos" w:hAnsi="Aptos"/>
+          <w:i/>
+        </w:rPr>
+        <w:t xml:space="preserve">doet stap 3 t/m 5 automatisch (installeren, activeren, API-sleutel uit </w:t>
+      </w:r>
+      <w:r>
+        <w:rPr>
+          <w:rFonts w:ascii="Consolas" w:hAnsi="Consolas"/>
+          <w:i/>
+        </w:rPr>
+        <w:t>.env</w:t>
+      </w:r>
+    </w:p>
+    <w:p>
+      <w:r>
+        <w:rPr>
+          <w:rFonts w:ascii="Aptos" w:hAnsi="Aptos"/>
+          <w:i/>
+        </w:rPr>
+        <w:t xml:space="preserve">laden) en laat een venster achter waarin je direct </w:t>
+      </w:r>
+      <w:r>
+        <w:rPr>
+          <w:rFonts w:ascii="Consolas" w:hAnsi="Consolas"/>
+          <w:i/>
+        </w:rPr>
+        <w:t>rie-toets ...</w:t>
+      </w:r>
+      <w:r>
+        <w:rPr>
+          <w:rFonts w:ascii="Aptos" w:hAnsi="Aptos"/>
+          <w:i/>
+        </w:rPr>
+        <w:t xml:space="preserve"> kunt typen.</w:t>
+      </w:r>
+    </w:p>
+    <w:p>
+      <w:r>
+        <w:rPr>
+          <w:rFonts w:ascii="Aptos" w:hAnsi="Aptos"/>
+          <w:i/>
+        </w:rPr>
+        <w:t>De stappen hieronder zijn de handmatige variant.</w:t>
       </w:r>
     </w:p>
     <w:p>

</xml_diff>